<commit_message>
eGOS spec Rev 2 — fold in Nova eGOS user-guide detail
Adds: GOS3 takeaway voucher-/authorisation-code issue on submit with the
Terminated status; the cross-practice GOS3 Retrieval form type and
workflow (matched by voucher + authorisation codes on name/DoB/address);
signature capture before the sight exam with a 12-hour stored signature
apportioned to the claim, and reuse of an existing captured signature for
adults not needing a carer; patient-declaration fields (signatory
identity, ethnicity, declaration date, able-to-sign); a cross-module
dependency on the sight-exam record (Clinical Entry module); and the NHS
status names Validated / Terminated / Payment Sent reconciled into the
lifecycle. Regenerates the Word doc (Rev 2 header). Additive.

Co-Authored-By: Claude Opus 4.8 <noreply@anthropic.com>
Claude-Session: https://claude.ai/code/session_01Rob8CwzKsNco8nruXLFCoh
</commit_message>
<xml_diff>
--- a/docs/eGOS-Implementation-Spec.docx
+++ b/docs/eGOS-Implementation-Spec.docx
@@ -15,7 +15,7 @@
         <w:pStyle w:val="Subtitle"/>
       </w:pPr>
       <w:r>
-        <w:t xml:space="preserve">SmartOptics · Rev 1 · 29 June 2026 · Confidential — Internal Only</w:t>
+        <w:t xml:space="preserve">SmartOptics · Rev 2 · 1 July 2026 · Confidential — Internal Only</w:t>
       </w:r>
     </w:p>
     <w:sdt>
@@ -134,7 +134,7 @@
               <w:pStyle w:val="Compact"/>
             </w:pPr>
             <w:r>
-              <w:t xml:space="preserve">Rev 1 — initial draft. Specifies the NHS England electronic GOS claims module: GOS 1 / 3 / 4 / 5 / 6, Pre-Visit Notifications and domiciliary, e-signature capture, submission to NHS / PCSE, payment and till reconciliation, worklists and reporting. Folds in a competitive-gap review of Optix / Optix 2 and the incumbent FLEX / Nova product.</w:t>
+              <w:t xml:space="preserve">Rev 2 (supersedes Rev 1) — folds in the Nova eGOS user-guide detail: the GOS3 takeaway voucher-/authorisation-code issue on submit and the cross-practice GOS3 Retrieval workflow, signature capture before the sight exam with a 12-hour stored signature, the patient-declaration fields (signatory identity, ethnicity, declaration date, able-to-sign), a dependency on the sight-exam record, and the NHS status names (Validated / Terminated / Payment Sent). Additive — all Rev 1 content carries forward. Rev 1 — initial draft specifying the NHS England electronic GOS claims module: GOS 1 / 3 / 4 / 5 / 6, Pre-Visit Notifications and domiciliary, e-signature capture, submission to NHS / PCSE, payment and till reconciliation, worklists and reporting; folded in a competitive-gap review of Optix / Optix 2 and the incumbent FLEX / Nova product.</w:t>
             </w:r>
           </w:p>
         </w:tc>
@@ -340,6 +340,52 @@
               <w:pStyle w:val="Compact"/>
             </w:pPr>
             <w:r>
+              <w:t xml:space="preserve">1 Jul 2026</w:t>
+            </w:r>
+          </w:p>
+        </w:tc>
+        <w:tc>
+          <w:tcPr/>
+          <w:p>
+            <w:pPr>
+              <w:pStyle w:val="Compact"/>
+            </w:pPr>
+            <w:r>
+              <w:t xml:space="preserve">Claude</w:t>
+            </w:r>
+          </w:p>
+        </w:tc>
+        <w:tc>
+          <w:tcPr/>
+          <w:p>
+            <w:pPr>
+              <w:pStyle w:val="Compact"/>
+            </w:pPr>
+            <w:r>
+              <w:t xml:space="preserve">Rev 2</w:t>
+            </w:r>
+          </w:p>
+        </w:tc>
+        <w:tc>
+          <w:tcPr/>
+          <w:p>
+            <w:pPr>
+              <w:pStyle w:val="Compact"/>
+            </w:pPr>
+            <w:r>
+              <w:t xml:space="preserve">Nova eGOS user-guide fold-in. Adds the GOS3 takeaway voucher-/authorisation-code issue on submit (§8.2) and the cross-practice GOS3 Retrieval form type and workflow (§3, §8.2a); signature capture before the sight exam with a 12-hour stored signature apportioned to the claim, and reuse of an existing captured signature for adults not needing a carer (§9.2); the patient-declaration fields — signatory identity, ethnicity, declaration date, able-to-sign (§9.1, §11); a cross-module dependency on the sight-exam record from the Clinical Entry module (§0.6); and the NHS status names Validated, Terminated (submitted takeaway) and Payment Sent reconciled into the lifecycle (§6). Additive — all Rev 1 content carries forward.</w:t>
+            </w:r>
+          </w:p>
+        </w:tc>
+      </w:tr>
+      <w:tr>
+        <w:tc>
+          <w:tcPr/>
+          <w:p>
+            <w:pPr>
+              <w:pStyle w:val="Compact"/>
+            </w:pPr>
+            <w:r>
               <w:t xml:space="preserve">29 Jun 2026</w:t>
             </w:r>
           </w:p>
@@ -380,7 +426,7 @@
       </w:tr>
     </w:tbl>
     <w:bookmarkEnd w:id="18"/>
-    <w:bookmarkStart w:id="24" w:name="critical-issues-read-before-sign-off"/>
+    <w:bookmarkStart w:id="25" w:name="critical-issues-read-before-sign-off"/>
     <w:p>
       <w:pPr>
         <w:pStyle w:val="Heading1"/>
@@ -537,8 +583,26 @@
       </w:r>
     </w:p>
     <w:bookmarkEnd w:id="23"/>
+    <w:bookmarkStart w:id="24" w:name="X4e67cb49f7ace39573f84b320ff77527ce2f9d7"/>
+    <w:p>
+      <w:pPr>
+        <w:pStyle w:val="Heading2"/>
+      </w:pPr>
+      <w:r>
+        <w:t xml:space="preserve">0.6 IMPORTANT — Every claim requires a sight-exam record from the Clinical Entry module</w:t>
+      </w:r>
+    </w:p>
+    <w:p>
+      <w:pPr>
+        <w:pStyle w:val="FirstParagraph"/>
+      </w:pPr>
+      <w:r>
+        <w:t xml:space="preserve">Each GOS claim requires a linked sight-exam (refraction) record, from which much of the form is auto-populated. The eGOS module reads that record; it is owned by the Clinical Entry module. A GOS1 may be signed on patient arrival before the exam is keyed — the signature is stored for 12 hours and apportioned once the exam is added (§7, §9.2) — but the claim cannot be completed and submitted until its sight-exam record exists.</w:t>
+      </w:r>
+    </w:p>
     <w:bookmarkEnd w:id="24"/>
-    <w:bookmarkStart w:id="25" w:name="objective-and-goal-statement"/>
+    <w:bookmarkEnd w:id="25"/>
+    <w:bookmarkStart w:id="26" w:name="objective-and-goal-statement"/>
     <w:p>
       <w:pPr>
         <w:pStyle w:val="Heading1"/>
@@ -673,8 +737,8 @@
         <w:t xml:space="preserve">What has been claimed, accepted, paid, under-paid and is ageing toward the deadline is shown as a live cashflow view, not reconstructed monthly by hand.</w:t>
       </w:r>
     </w:p>
-    <w:bookmarkEnd w:id="25"/>
-    <w:bookmarkStart w:id="28" w:name="scope"/>
+    <w:bookmarkEnd w:id="26"/>
+    <w:bookmarkStart w:id="29" w:name="scope"/>
     <w:p>
       <w:pPr>
         <w:pStyle w:val="Heading1"/>
@@ -683,7 +747,7 @@
         <w:t xml:space="preserve">2. Scope</w:t>
       </w:r>
     </w:p>
-    <w:bookmarkStart w:id="26" w:name="in-scope"/>
+    <w:bookmarkStart w:id="27" w:name="in-scope"/>
     <w:p>
       <w:pPr>
         <w:pStyle w:val="Heading2"/>
@@ -725,6 +789,18 @@
         </w:numPr>
       </w:pPr>
       <w:r>
+        <w:t xml:space="preserve">GOS 3 Retrieval — completing, at the dispensing practice, a takeaway voucher a patient obtained from another practice, matched by voucher and authorisation codes (§8.2a).</w:t>
+      </w:r>
+    </w:p>
+    <w:p>
+      <w:pPr>
+        <w:pStyle w:val="Compact"/>
+        <w:numPr>
+          <w:ilvl w:val="0"/>
+          <w:numId w:val="1002"/>
+        </w:numPr>
+      </w:pPr>
+      <w:r>
         <w:t xml:space="preserve">GOS 4 (repair / replacement) including the NHS approval code for adults.</w:t>
       </w:r>
     </w:p>
@@ -836,8 +912,8 @@
         <w:t xml:space="preserve">Per-branch configuration and the Performer / Contractor / pre-registration roles (§5).</w:t>
       </w:r>
     </w:p>
-    <w:bookmarkEnd w:id="26"/>
-    <w:bookmarkStart w:id="27" w:name="out-of-scope"/>
+    <w:bookmarkEnd w:id="27"/>
+    <w:bookmarkStart w:id="28" w:name="out-of-scope"/>
     <w:p>
       <w:pPr>
         <w:pStyle w:val="Heading2"/>
@@ -918,9 +994,9 @@
         <w:t xml:space="preserve">Private (non-GOS) claims.</w:t>
       </w:r>
     </w:p>
-    <w:bookmarkEnd w:id="27"/>
     <w:bookmarkEnd w:id="28"/>
-    <w:bookmarkStart w:id="29" w:name="conceptual-model"/>
+    <w:bookmarkEnd w:id="29"/>
+    <w:bookmarkStart w:id="30" w:name="conceptual-model"/>
     <w:p>
       <w:pPr>
         <w:pStyle w:val="Heading1"/>
@@ -1026,6 +1102,21 @@
         <w:rPr>
           <w:rStyle w:val="VerbatimChar"/>
         </w:rPr>
+        <w:t xml:space="preserve">GOS3_RETRIEVAL</w:t>
+      </w:r>
+      <w:r>
+        <w:t xml:space="preserve"> </w:t>
+      </w:r>
+      <w:r>
+        <w:t xml:space="preserve">(retrieve a takeaway issued elsewhere),</w:t>
+      </w:r>
+      <w:r>
+        <w:t xml:space="preserve"> </w:t>
+      </w:r>
+      <w:r>
+        <w:rPr>
+          <w:rStyle w:val="VerbatimChar"/>
+        </w:rPr>
         <w:t xml:space="preserve">GOS4</w:t>
       </w:r>
       <w:r>
@@ -1069,6 +1160,57 @@
           <w:b/>
           <w:bCs/>
         </w:rPr>
+        <w:t xml:space="preserve">Takeaway codes</w:t>
+      </w:r>
+      <w:r>
+        <w:t xml:space="preserve"> </w:t>
+      </w:r>
+      <w:r>
+        <w:t xml:space="preserve">— on submitting a GOS3 voucher-only (takeaway) claim, the NHS issues a</w:t>
+      </w:r>
+      <w:r>
+        <w:t xml:space="preserve"> </w:t>
+      </w:r>
+      <w:r>
+        <w:rPr>
+          <w:b/>
+          <w:bCs/>
+        </w:rPr>
+        <w:t xml:space="preserve">voucher code</w:t>
+      </w:r>
+      <w:r>
+        <w:t xml:space="preserve"> </w:t>
+      </w:r>
+      <w:r>
+        <w:t xml:space="preserve">and an</w:t>
+      </w:r>
+      <w:r>
+        <w:t xml:space="preserve"> </w:t>
+      </w:r>
+      <w:r>
+        <w:rPr>
+          <w:b/>
+          <w:bCs/>
+        </w:rPr>
+        <w:t xml:space="preserve">authorisation code</w:t>
+      </w:r>
+      <w:r>
+        <w:t xml:space="preserve">; these are printed on the voucher (or emailed to the patient) and are what another practice enters to retrieve and complete the claim (§8.2a).</w:t>
+      </w:r>
+    </w:p>
+    <w:p>
+      <w:pPr>
+        <w:pStyle w:val="Compact"/>
+        <w:numPr>
+          <w:ilvl w:val="0"/>
+          <w:numId w:val="1004"/>
+        </w:numPr>
+      </w:pPr>
+      <w:r>
+        <w:rPr>
+          <w:b/>
+          <w:bCs/>
+        </w:rPr>
         <w:t xml:space="preserve">PVN (Pre-Visit Notification)</w:t>
       </w:r>
       <w:r>
@@ -1166,8 +1308,8 @@
         <w:t xml:space="preserve">— the set of prerequisites that, once all met, cause a claim to submit itself (§7).</w:t>
       </w:r>
     </w:p>
-    <w:bookmarkEnd w:id="29"/>
-    <w:bookmarkStart w:id="30" w:name="where-the-egos-module-sits-in-the-pms"/>
+    <w:bookmarkEnd w:id="30"/>
+    <w:bookmarkStart w:id="31" w:name="where-the-egos-module-sits-in-the-pms"/>
     <w:p>
       <w:pPr>
         <w:pStyle w:val="Heading1"/>
@@ -1379,8 +1521,8 @@
         </w:tc>
       </w:tr>
     </w:tbl>
-    <w:bookmarkEnd w:id="30"/>
-    <w:bookmarkStart w:id="33" w:name="configuration-and-roles"/>
+    <w:bookmarkEnd w:id="31"/>
+    <w:bookmarkStart w:id="34" w:name="configuration-and-roles"/>
     <w:p>
       <w:pPr>
         <w:pStyle w:val="Heading1"/>
@@ -1389,7 +1531,7 @@
         <w:t xml:space="preserve">5. Configuration and roles</w:t>
       </w:r>
     </w:p>
-    <w:bookmarkStart w:id="31" w:name="per-branch-configuration"/>
+    <w:bookmarkStart w:id="32" w:name="per-branch-configuration"/>
     <w:p>
       <w:pPr>
         <w:pStyle w:val="Heading2"/>
@@ -1553,8 +1695,8 @@
         <w:t xml:space="preserve">Multi-branch groups configure each branch separately, because the NHS contractor identity (licence number, ODS code, PSK) is per branch — every submission carries the correct identity.</w:t>
       </w:r>
     </w:p>
-    <w:bookmarkEnd w:id="31"/>
-    <w:bookmarkStart w:id="32" w:name="clinical-roles"/>
+    <w:bookmarkEnd w:id="32"/>
+    <w:bookmarkStart w:id="33" w:name="clinical-roles"/>
     <w:p>
       <w:pPr>
         <w:pStyle w:val="Heading2"/>
@@ -1673,9 +1815,9 @@
         <w:t xml:space="preserve">capability is granted to the relevant staff roles.</w:t>
       </w:r>
     </w:p>
-    <w:bookmarkEnd w:id="32"/>
     <w:bookmarkEnd w:id="33"/>
-    <w:bookmarkStart w:id="34" w:name="claim-lifecycle"/>
+    <w:bookmarkEnd w:id="34"/>
+    <w:bookmarkStart w:id="35" w:name="claim-lifecycle"/>
     <w:p>
       <w:pPr>
         <w:pStyle w:val="Heading1"/>
@@ -1794,7 +1936,35 @@
         <w:t xml:space="preserve">PAID</w:t>
       </w:r>
       <w:r>
-        <w:t xml:space="preserve">; these populate the worklists staff action.</w:t>
+        <w:t xml:space="preserve"> </w:t>
+      </w:r>
+      <w:r>
+        <w:t xml:space="preserve">(</w:t>
+      </w:r>
+      <w:r>
+        <w:rPr>
+          <w:rStyle w:val="VerbatimChar"/>
+        </w:rPr>
+        <w:t xml:space="preserve">READY TO CLAIM</w:t>
+      </w:r>
+      <w:r>
+        <w:t xml:space="preserve"> </w:t>
+      </w:r>
+      <w:r>
+        <w:t xml:space="preserve">is also shown as</w:t>
+      </w:r>
+      <w:r>
+        <w:t xml:space="preserve"> </w:t>
+      </w:r>
+      <w:r>
+        <w:rPr>
+          <w:i/>
+          <w:iCs/>
+        </w:rPr>
+        <w:t xml:space="preserve">Ready For Claim</w:t>
+      </w:r>
+      <w:r>
+        <w:t xml:space="preserve">); these populate the worklists staff action.</w:t>
       </w:r>
     </w:p>
     <w:p>
@@ -1806,6 +1976,64 @@
         </w:numPr>
       </w:pPr>
       <w:r>
+        <w:t xml:space="preserve">Between</w:t>
+      </w:r>
+      <w:r>
+        <w:t xml:space="preserve"> </w:t>
+      </w:r>
+      <w:r>
+        <w:rPr>
+          <w:rStyle w:val="VerbatimChar"/>
+        </w:rPr>
+        <w:t xml:space="preserve">SUBMITTED</w:t>
+      </w:r>
+      <w:r>
+        <w:t xml:space="preserve"> </w:t>
+      </w:r>
+      <w:r>
+        <w:t xml:space="preserve">and</w:t>
+      </w:r>
+      <w:r>
+        <w:t xml:space="preserve"> </w:t>
+      </w:r>
+      <w:r>
+        <w:rPr>
+          <w:rStyle w:val="VerbatimChar"/>
+        </w:rPr>
+        <w:t xml:space="preserve">ACCEPTED</w:t>
+      </w:r>
+      <w:r>
+        <w:t xml:space="preserve"> </w:t>
+      </w:r>
+      <w:r>
+        <w:t xml:space="preserve">the NHS reports a</w:t>
+      </w:r>
+      <w:r>
+        <w:t xml:space="preserve"> </w:t>
+      </w:r>
+      <w:r>
+        <w:rPr>
+          <w:b/>
+          <w:bCs/>
+        </w:rPr>
+        <w:t xml:space="preserve">Validated</w:t>
+      </w:r>
+      <w:r>
+        <w:t xml:space="preserve"> </w:t>
+      </w:r>
+      <w:r>
+        <w:t xml:space="preserve">step (the claim passed validation and awaits acceptance); it is shown in the claim’s status history.</w:t>
+      </w:r>
+    </w:p>
+    <w:p>
+      <w:pPr>
+        <w:pStyle w:val="Compact"/>
+        <w:numPr>
+          <w:ilvl w:val="0"/>
+          <w:numId w:val="1007"/>
+        </w:numPr>
+      </w:pPr>
+      <w:r>
         <w:rPr>
           <w:b/>
           <w:bCs/>
@@ -1831,7 +2059,7 @@
         <w:t xml:space="preserve"> </w:t>
       </w:r>
       <w:r>
-        <w:t xml:space="preserve">(NHS has accepted it) or</w:t>
+        <w:t xml:space="preserve">(NHS has accepted it; goes for payment later) or</w:t>
       </w:r>
       <w:r>
         <w:t xml:space="preserve"> </w:t>
@@ -1846,7 +2074,23 @@
         <w:t xml:space="preserve"> </w:t>
       </w:r>
       <w:r>
-        <w:t xml:space="preserve">(money reconciled against a statement).</w:t>
+        <w:t xml:space="preserve">— the NHS calls the final paid state</w:t>
+      </w:r>
+      <w:r>
+        <w:t xml:space="preserve"> </w:t>
+      </w:r>
+      <w:r>
+        <w:rPr>
+          <w:b/>
+          <w:bCs/>
+        </w:rPr>
+        <w:t xml:space="preserve">Payment Sent</w:t>
+      </w:r>
+      <w:r>
+        <w:t xml:space="preserve"> </w:t>
+      </w:r>
+      <w:r>
+        <w:t xml:space="preserve">— money reconciled against the statement (§8.6).</w:t>
       </w:r>
     </w:p>
     <w:p>
@@ -1858,6 +2102,50 @@
         </w:numPr>
       </w:pPr>
       <w:r>
+        <w:t xml:space="preserve">A submitted</w:t>
+      </w:r>
+      <w:r>
+        <w:t xml:space="preserve"> </w:t>
+      </w:r>
+      <w:r>
+        <w:rPr>
+          <w:b/>
+          <w:bCs/>
+        </w:rPr>
+        <w:t xml:space="preserve">GOS3 voucher-only (takeaway)</w:t>
+      </w:r>
+      <w:r>
+        <w:t xml:space="preserve"> </w:t>
+      </w:r>
+      <w:r>
+        <w:t xml:space="preserve">claim does not proceed to Accepted / Payment Sent; it ends at</w:t>
+      </w:r>
+      <w:r>
+        <w:t xml:space="preserve"> </w:t>
+      </w:r>
+      <w:r>
+        <w:rPr>
+          <w:b/>
+          <w:bCs/>
+        </w:rPr>
+        <w:t xml:space="preserve">Terminated</w:t>
+      </w:r>
+      <w:r>
+        <w:t xml:space="preserve"> </w:t>
+      </w:r>
+      <w:r>
+        <w:t xml:space="preserve">once its voucher and authorisation codes are issued for use elsewhere (§8.2a).</w:t>
+      </w:r>
+    </w:p>
+    <w:p>
+      <w:pPr>
+        <w:pStyle w:val="Compact"/>
+        <w:numPr>
+          <w:ilvl w:val="0"/>
+          <w:numId w:val="1007"/>
+        </w:numPr>
+      </w:pPr>
+      <w:r>
         <w:rPr>
           <w:rStyle w:val="VerbatimChar"/>
         </w:rPr>
@@ -1912,8 +2200,8 @@
         <w:t xml:space="preserve">Every transition writes an immutable event (§11) for NHS post-payment verification.</w:t>
       </w:r>
     </w:p>
-    <w:bookmarkEnd w:id="34"/>
-    <w:bookmarkStart w:id="35" w:name="Xaff26cc697a349530ab6dbbaee3345a201e02b0"/>
+    <w:bookmarkEnd w:id="35"/>
+    <w:bookmarkStart w:id="36" w:name="Xaff26cc697a349530ab6dbbaee3345a201e02b0"/>
     <w:p>
       <w:pPr>
         <w:pStyle w:val="Heading1"/>
@@ -2145,8 +2433,32 @@
         <w:t xml:space="preserve">and the submission worker (§12) picks it up. The dashboard shows each claim’s checklist so staff can see at a glance what is outstanding. No daily preparation is needed — staff simply act as each patient comes through. Different form types carry different prerequisite sets (GOS4 needs only the supplier signature; GOS3 has a two-stage patient signature — §8.2).</w:t>
       </w:r>
     </w:p>
-    <w:bookmarkEnd w:id="35"/>
-    <w:bookmarkStart w:id="42" w:name="core-workflows"/>
+    <w:p>
+      <w:pPr>
+        <w:pStyle w:val="BodyText"/>
+      </w:pPr>
+      <w:r>
+        <w:t xml:space="preserve">The checklist steps need not be completed in order. In particular, a GOS1 patient may sign on arrival</w:t>
+      </w:r>
+      <w:r>
+        <w:t xml:space="preserve"> </w:t>
+      </w:r>
+      <w:r>
+        <w:rPr>
+          <w:b/>
+          <w:bCs/>
+        </w:rPr>
+        <w:t xml:space="preserve">before</w:t>
+      </w:r>
+      <w:r>
+        <w:t xml:space="preserve"> </w:t>
+      </w:r>
+      <w:r>
+        <w:t xml:space="preserve">the sight exam is keyed: the signature is captured against the patient record, stored for 12 hours, and apportioned to the claim once the exam is added (§9.2). The claim still cannot submit until its sight-exam record exists (§0.6). Practices are advised to clear and submit all claims by end of day, because signatures are captured on the day of the visit.</w:t>
+      </w:r>
+    </w:p>
+    <w:bookmarkEnd w:id="36"/>
+    <w:bookmarkStart w:id="44" w:name="core-workflows"/>
     <w:p>
       <w:pPr>
         <w:pStyle w:val="Heading1"/>
@@ -2155,7 +2467,7 @@
         <w:t xml:space="preserve">8. Core workflows</w:t>
       </w:r>
     </w:p>
-    <w:bookmarkStart w:id="36" w:name="gos1-nhs-sight-test"/>
+    <w:bookmarkStart w:id="37" w:name="gos1-nhs-sight-test"/>
     <w:p>
       <w:pPr>
         <w:pStyle w:val="Heading2"/>
@@ -2253,8 +2565,8 @@
         <w:t xml:space="preserve">The NHS response returns asynchronously and the status advances to Accepted (or Rejected with a reason).</w:t>
       </w:r>
     </w:p>
-    <w:bookmarkEnd w:id="36"/>
-    <w:bookmarkStart w:id="37" w:name="gos3-optical-voucher-including-takeaway"/>
+    <w:bookmarkEnd w:id="37"/>
+    <w:bookmarkStart w:id="38" w:name="gos3-optical-voucher-including-takeaway"/>
     <w:p>
       <w:pPr>
         <w:pStyle w:val="Heading2"/>
@@ -2387,16 +2699,163 @@
         <w:t xml:space="preserve"> </w:t>
       </w:r>
       <w:r>
-        <w:t xml:space="preserve">where the patient takes the voucher elsewhere, the claim is flagged as takeaway; the module tracks outstanding takeaway vouchers and provides a retrieval / chase list (§10) and a write-off path for uncollected ones near the deadline.</w:t>
-      </w:r>
-    </w:p>
-    <w:bookmarkEnd w:id="37"/>
-    <w:bookmarkStart w:id="38" w:name="gos4-repair-replacement"/>
+        <w:t xml:space="preserve">where the patient takes the prescription to be dispensed elsewhere, a voucher-only claim is raised — link the existing GOS1, add the sight exam, the performer signs, and submit.</w:t>
+      </w:r>
+      <w:r>
+        <w:t xml:space="preserve"> </w:t>
+      </w:r>
+      <w:r>
+        <w:rPr>
+          <w:b/>
+          <w:bCs/>
+        </w:rPr>
+        <w:t xml:space="preserve">Only on submission does the NHS issue the voucher code and authorisation code</w:t>
+      </w:r>
+      <w:r>
+        <w:t xml:space="preserve">; the claim then moves to</w:t>
+      </w:r>
+      <w:r>
+        <w:t xml:space="preserve"> </w:t>
+      </w:r>
+      <w:r>
+        <w:rPr>
+          <w:b/>
+          <w:bCs/>
+        </w:rPr>
+        <w:t xml:space="preserve">Terminated</w:t>
+      </w:r>
+      <w:r>
+        <w:t xml:space="preserve"> </w:t>
+      </w:r>
+      <w:r>
+        <w:t xml:space="preserve">(it does not go to Accepted / Payment Sent). The voucher — carrying the two codes and the practice details — is printed on plain paper or emailed to the patient. The module also tracks outstanding takeaway vouchers with a chase list (§10) and a write-off path near the deadline.</w:t>
+      </w:r>
+    </w:p>
+    <w:bookmarkEnd w:id="38"/>
+    <w:bookmarkStart w:id="39" w:name="Xc8c567325be3b0890bcc6bb1f230184454e0c31"/>
     <w:p>
       <w:pPr>
         <w:pStyle w:val="Heading2"/>
       </w:pPr>
       <w:r>
+        <w:t xml:space="preserve">8.2a GOS3 Retrieval — completing a takeaway issued elsewhere</w:t>
+      </w:r>
+    </w:p>
+    <w:p>
+      <w:pPr>
+        <w:pStyle w:val="FirstParagraph"/>
+      </w:pPr>
+      <w:r>
+        <w:t xml:space="preserve">When a patient was tested at another practice and brings their takeaway voucher here to be dispensed, the claim is already lodged with the NHS awaiting completion. To retrieve it:</w:t>
+      </w:r>
+    </w:p>
+    <w:p>
+      <w:pPr>
+        <w:pStyle w:val="Compact"/>
+        <w:numPr>
+          <w:ilvl w:val="0"/>
+          <w:numId w:val="1010"/>
+        </w:numPr>
+      </w:pPr>
+      <w:r>
+        <w:t xml:space="preserve">Ensure the patient exists in the system with</w:t>
+      </w:r>
+      <w:r>
+        <w:t xml:space="preserve"> </w:t>
+      </w:r>
+      <w:r>
+        <w:rPr>
+          <w:b/>
+          <w:bCs/>
+        </w:rPr>
+        <w:t xml:space="preserve">name, date of birth and address correct</w:t>
+      </w:r>
+      <w:r>
+        <w:t xml:space="preserve"> </w:t>
+      </w:r>
+      <w:r>
+        <w:t xml:space="preserve">— these are matched against the NHS record to pull the right claim.</w:t>
+      </w:r>
+    </w:p>
+    <w:p>
+      <w:pPr>
+        <w:pStyle w:val="Compact"/>
+        <w:numPr>
+          <w:ilvl w:val="0"/>
+          <w:numId w:val="1010"/>
+        </w:numPr>
+      </w:pPr>
+      <w:r>
+        <w:t xml:space="preserve">From the patient record, select</w:t>
+      </w:r>
+      <w:r>
+        <w:t xml:space="preserve"> </w:t>
+      </w:r>
+      <w:r>
+        <w:rPr>
+          <w:b/>
+          <w:bCs/>
+        </w:rPr>
+        <w:t xml:space="preserve">New → GOS 3 Retrieval</w:t>
+      </w:r>
+      <w:r>
+        <w:t xml:space="preserve"> </w:t>
+      </w:r>
+      <w:r>
+        <w:t xml:space="preserve">and enter the patient’s</w:t>
+      </w:r>
+      <w:r>
+        <w:t xml:space="preserve"> </w:t>
+      </w:r>
+      <w:r>
+        <w:rPr>
+          <w:b/>
+          <w:bCs/>
+        </w:rPr>
+        <w:t xml:space="preserve">voucher code</w:t>
+      </w:r>
+      <w:r>
+        <w:t xml:space="preserve"> </w:t>
+      </w:r>
+      <w:r>
+        <w:t xml:space="preserve">and</w:t>
+      </w:r>
+      <w:r>
+        <w:t xml:space="preserve"> </w:t>
+      </w:r>
+      <w:r>
+        <w:rPr>
+          <w:b/>
+          <w:bCs/>
+        </w:rPr>
+        <w:t xml:space="preserve">authorisation code</w:t>
+      </w:r>
+      <w:r>
+        <w:t xml:space="preserve"> </w:t>
+      </w:r>
+      <w:r>
+        <w:t xml:space="preserve">(the two codes issued to them by the originating practice — §8.2 item 6).</w:t>
+      </w:r>
+    </w:p>
+    <w:p>
+      <w:pPr>
+        <w:pStyle w:val="Compact"/>
+        <w:numPr>
+          <w:ilvl w:val="0"/>
+          <w:numId w:val="1010"/>
+        </w:numPr>
+      </w:pPr>
+      <w:r>
+        <w:t xml:space="preserve">On a successful match the claim is retrieved and then completed and submitted exactly like a normal GOS3.</w:t>
+      </w:r>
+    </w:p>
+    <w:bookmarkEnd w:id="39"/>
+    <w:bookmarkStart w:id="40" w:name="gos4-repair-replacement"/>
+    <w:p>
+      <w:pPr>
+        <w:pStyle w:val="Heading2"/>
+      </w:pPr>
+      <w:r>
         <w:t xml:space="preserve">8.3 GOS4 — repair / replacement</w:t>
       </w:r>
     </w:p>
@@ -2405,7 +2864,7 @@
         <w:pStyle w:val="Compact"/>
         <w:numPr>
           <w:ilvl w:val="0"/>
-          <w:numId w:val="1010"/>
+          <w:numId w:val="1011"/>
         </w:numPr>
       </w:pPr>
       <w:r>
@@ -2417,7 +2876,7 @@
         <w:pStyle w:val="Compact"/>
         <w:numPr>
           <w:ilvl w:val="0"/>
-          <w:numId w:val="1010"/>
+          <w:numId w:val="1011"/>
         </w:numPr>
       </w:pPr>
       <w:r>
@@ -2442,15 +2901,15 @@
         <w:pStyle w:val="Compact"/>
         <w:numPr>
           <w:ilvl w:val="0"/>
-          <w:numId w:val="1010"/>
+          <w:numId w:val="1011"/>
         </w:numPr>
       </w:pPr>
       <w:r>
         <w:t xml:space="preserve">Lighter signing: only the supplier / contractor signs, so its readiness checklist is shorter.</w:t>
       </w:r>
     </w:p>
-    <w:bookmarkEnd w:id="38"/>
-    <w:bookmarkStart w:id="39" w:name="gos6-domiciliary-via-a-pvn"/>
+    <w:bookmarkEnd w:id="40"/>
+    <w:bookmarkStart w:id="41" w:name="gos6-domiciliary-via-a-pvn"/>
     <w:p>
       <w:pPr>
         <w:pStyle w:val="Heading2"/>
@@ -2464,7 +2923,7 @@
         <w:pStyle w:val="Compact"/>
         <w:numPr>
           <w:ilvl w:val="0"/>
-          <w:numId w:val="1011"/>
+          <w:numId w:val="1012"/>
         </w:numPr>
       </w:pPr>
       <w:r>
@@ -2486,7 +2945,7 @@
         <w:pStyle w:val="Compact"/>
         <w:numPr>
           <w:ilvl w:val="0"/>
-          <w:numId w:val="1011"/>
+          <w:numId w:val="1012"/>
         </w:numPr>
       </w:pPr>
       <w:r>
@@ -2505,7 +2964,7 @@
         <w:pStyle w:val="Compact"/>
         <w:numPr>
           <w:ilvl w:val="0"/>
-          <w:numId w:val="1011"/>
+          <w:numId w:val="1012"/>
         </w:numPr>
       </w:pPr>
       <w:r>
@@ -2530,7 +2989,7 @@
         <w:pStyle w:val="Compact"/>
         <w:numPr>
           <w:ilvl w:val="0"/>
-          <w:numId w:val="1011"/>
+          <w:numId w:val="1012"/>
         </w:numPr>
       </w:pPr>
       <w:r>
@@ -2542,7 +3001,7 @@
         <w:pStyle w:val="Compact"/>
         <w:numPr>
           <w:ilvl w:val="0"/>
-          <w:numId w:val="1011"/>
+          <w:numId w:val="1012"/>
         </w:numPr>
       </w:pPr>
       <w:r>
@@ -2570,7 +3029,7 @@
         <w:pStyle w:val="Compact"/>
         <w:numPr>
           <w:ilvl w:val="0"/>
-          <w:numId w:val="1011"/>
+          <w:numId w:val="1012"/>
         </w:numPr>
       </w:pPr>
       <w:r>
@@ -2600,8 +3059,8 @@
         <w:t xml:space="preserve">.</w:t>
       </w:r>
     </w:p>
-    <w:bookmarkEnd w:id="39"/>
-    <w:bookmarkStart w:id="40" w:name="end-of-day-check"/>
+    <w:bookmarkEnd w:id="41"/>
+    <w:bookmarkStart w:id="42" w:name="end-of-day-check"/>
     <w:p>
       <w:pPr>
         <w:pStyle w:val="Heading2"/>
@@ -2630,8 +3089,8 @@
         <w:t xml:space="preserve">view and dashboard tile let staff confirm that every appointment and voucher that should have produced a claim did, and that nothing is stuck in Data Entry in Progress or Rejected — comparing accepted-claim count against appointments in the diary and vouchers through the till.</w:t>
       </w:r>
     </w:p>
-    <w:bookmarkEnd w:id="40"/>
-    <w:bookmarkStart w:id="41" w:name="monthly-payment-reconciliation"/>
+    <w:bookmarkEnd w:id="42"/>
+    <w:bookmarkStart w:id="43" w:name="monthly-payment-reconciliation"/>
     <w:p>
       <w:pPr>
         <w:pStyle w:val="Heading2"/>
@@ -2648,9 +3107,9 @@
         <w:t xml:space="preserve">The PCSE statement is imported (in the Business Intelligence module), matched to claims, and claims are set Paid with paid amount and date; under / over-payments (especially GOS3 / GOS4) are flagged. The imported statement is retained for the accountant. Where the NHS later exposes a statement API, the manual import is replaced by an automatic nightly sync (§14).</w:t>
       </w:r>
     </w:p>
-    <w:bookmarkEnd w:id="41"/>
-    <w:bookmarkEnd w:id="42"/>
-    <w:bookmarkStart w:id="46" w:name="X89a8d552e837ac35206fb9449d6c61b1b2e505f"/>
+    <w:bookmarkEnd w:id="43"/>
+    <w:bookmarkEnd w:id="44"/>
+    <w:bookmarkStart w:id="48" w:name="X89a8d552e837ac35206fb9449d6c61b1b2e505f"/>
     <w:p>
       <w:pPr>
         <w:pStyle w:val="Heading1"/>
@@ -2659,7 +3118,7 @@
         <w:t xml:space="preserve">9. Signature capture, eligibility and rejection handling</w:t>
       </w:r>
     </w:p>
-    <w:bookmarkStart w:id="43" w:name="X7329635b247a778c34e71993c50ab915a440a4d"/>
+    <w:bookmarkStart w:id="45" w:name="X7329635b247a778c34e71993c50ab915a440a4d"/>
     <w:p>
       <w:pPr>
         <w:pStyle w:val="Heading2"/>
@@ -2681,7 +3140,7 @@
         <w:pStyle w:val="Compact"/>
         <w:numPr>
           <w:ilvl w:val="0"/>
-          <w:numId w:val="1012"/>
+          <w:numId w:val="1013"/>
         </w:numPr>
       </w:pPr>
       <w:r>
@@ -2693,7 +3152,7 @@
         <w:pStyle w:val="Compact"/>
         <w:numPr>
           <w:ilvl w:val="0"/>
-          <w:numId w:val="1012"/>
+          <w:numId w:val="1013"/>
         </w:numPr>
       </w:pPr>
       <w:r>
@@ -2705,7 +3164,7 @@
         <w:pStyle w:val="Compact"/>
         <w:numPr>
           <w:ilvl w:val="0"/>
-          <w:numId w:val="1012"/>
+          <w:numId w:val="1013"/>
         </w:numPr>
       </w:pPr>
       <w:r>
@@ -2717,7 +3176,7 @@
         <w:pStyle w:val="Compact"/>
         <w:numPr>
           <w:ilvl w:val="0"/>
-          <w:numId w:val="1012"/>
+          <w:numId w:val="1013"/>
         </w:numPr>
       </w:pPr>
       <w:r>
@@ -2741,15 +3200,69 @@
         <w:pStyle w:val="Compact"/>
         <w:numPr>
           <w:ilvl w:val="0"/>
-          <w:numId w:val="1012"/>
+          <w:numId w:val="1013"/>
         </w:numPr>
       </w:pPr>
       <w:r>
         <w:t xml:space="preserve">The GOC number format is validated on the performer’s record; retest codes are constrained to valid values.</w:t>
       </w:r>
     </w:p>
-    <w:bookmarkEnd w:id="43"/>
-    <w:bookmarkStart w:id="44" w:name="signature-capture-cloud-native"/>
+    <w:p>
+      <w:pPr>
+        <w:pStyle w:val="Compact"/>
+        <w:numPr>
+          <w:ilvl w:val="0"/>
+          <w:numId w:val="1013"/>
+        </w:numPr>
+      </w:pPr>
+      <w:r>
+        <w:t xml:space="preserve">The patient declaration captures the</w:t>
+      </w:r>
+      <w:r>
+        <w:t xml:space="preserve"> </w:t>
+      </w:r>
+      <w:r>
+        <w:rPr>
+          <w:b/>
+          <w:bCs/>
+        </w:rPr>
+        <w:t xml:space="preserve">signatory’s identity</w:t>
+      </w:r>
+      <w:r>
+        <w:t xml:space="preserve"> </w:t>
+      </w:r>
+      <w:r>
+        <w:t xml:space="preserve">(patient / partner / parent / guardian),</w:t>
+      </w:r>
+      <w:r>
+        <w:t xml:space="preserve"> </w:t>
+      </w:r>
+      <w:r>
+        <w:rPr>
+          <w:b/>
+          <w:bCs/>
+        </w:rPr>
+        <w:t xml:space="preserve">ethnicity</w:t>
+      </w:r>
+      <w:r>
+        <w:t xml:space="preserve">, the</w:t>
+      </w:r>
+      <w:r>
+        <w:t xml:space="preserve"> </w:t>
+      </w:r>
+      <w:r>
+        <w:rPr>
+          <w:b/>
+          <w:bCs/>
+        </w:rPr>
+        <w:t xml:space="preserve">declaration date</w:t>
+      </w:r>
+      <w:r>
+        <w:t xml:space="preserve">, and whether the patient is able to sign (otherwise a carer signs); much of the rest of the form is auto-populated from the linked sight-exam record.</w:t>
+      </w:r>
+    </w:p>
+    <w:bookmarkEnd w:id="45"/>
+    <w:bookmarkStart w:id="46" w:name="signature-capture-cloud-native"/>
     <w:p>
       <w:pPr>
         <w:pStyle w:val="Heading2"/>
@@ -2771,7 +3284,7 @@
         <w:pStyle w:val="Compact"/>
         <w:numPr>
           <w:ilvl w:val="0"/>
-          <w:numId w:val="1013"/>
+          <w:numId w:val="1014"/>
         </w:numPr>
       </w:pPr>
       <w:r>
@@ -2783,7 +3296,29 @@
         <w:pStyle w:val="Compact"/>
         <w:numPr>
           <w:ilvl w:val="0"/>
-          <w:numId w:val="1013"/>
+          <w:numId w:val="1014"/>
+        </w:numPr>
+      </w:pPr>
+      <w:r>
+        <w:rPr>
+          <w:b/>
+          <w:bCs/>
+        </w:rPr>
+        <w:t xml:space="preserve">Sign before the exam / reuse a stored signature:</w:t>
+      </w:r>
+      <w:r>
+        <w:t xml:space="preserve"> </w:t>
+      </w:r>
+      <w:r>
+        <w:t xml:space="preserve">a patient may sign on arrival before the exam is keyed; the signature is stored for 12 hours and apportioned to the claim once the exam is added. Where a signature is already captured on the patient record it can be apportioned to a new claim — adults only, and only where no carer signature is required — rather than re-signing.</w:t>
+      </w:r>
+    </w:p>
+    <w:p>
+      <w:pPr>
+        <w:pStyle w:val="Compact"/>
+        <w:numPr>
+          <w:ilvl w:val="0"/>
+          <w:numId w:val="1014"/>
         </w:numPr>
       </w:pPr>
       <w:r>
@@ -2805,7 +3340,7 @@
         <w:pStyle w:val="Compact"/>
         <w:numPr>
           <w:ilvl w:val="0"/>
-          <w:numId w:val="1013"/>
+          <w:numId w:val="1014"/>
         </w:numPr>
       </w:pPr>
       <w:r>
@@ -2817,7 +3352,7 @@
         <w:pStyle w:val="Compact"/>
         <w:numPr>
           <w:ilvl w:val="0"/>
-          <w:numId w:val="1013"/>
+          <w:numId w:val="1014"/>
         </w:numPr>
       </w:pPr>
       <w:r>
@@ -2829,15 +3364,15 @@
         <w:pStyle w:val="Compact"/>
         <w:numPr>
           <w:ilvl w:val="0"/>
-          <w:numId w:val="1013"/>
+          <w:numId w:val="1014"/>
         </w:numPr>
       </w:pPr>
       <w:r>
         <w:t xml:space="preserve">The same flow works off-site for domiciliary; the device need only have internet, and a poor-signal capture syncs when back online.</w:t>
       </w:r>
     </w:p>
-    <w:bookmarkEnd w:id="44"/>
-    <w:bookmarkStart w:id="45" w:name="rejection-handling"/>
+    <w:bookmarkEnd w:id="46"/>
+    <w:bookmarkStart w:id="47" w:name="rejection-handling"/>
     <w:p>
       <w:pPr>
         <w:pStyle w:val="Heading2"/>
@@ -2851,7 +3386,7 @@
         <w:pStyle w:val="Compact"/>
         <w:numPr>
           <w:ilvl w:val="0"/>
-          <w:numId w:val="1014"/>
+          <w:numId w:val="1015"/>
         </w:numPr>
       </w:pPr>
       <w:r>
@@ -2863,7 +3398,7 @@
         <w:pStyle w:val="Compact"/>
         <w:numPr>
           <w:ilvl w:val="0"/>
-          <w:numId w:val="1014"/>
+          <w:numId w:val="1015"/>
         </w:numPr>
       </w:pPr>
       <w:r>
@@ -2875,16 +3410,16 @@
         <w:pStyle w:val="Compact"/>
         <w:numPr>
           <w:ilvl w:val="0"/>
-          <w:numId w:val="1014"/>
+          <w:numId w:val="1015"/>
         </w:numPr>
       </w:pPr>
       <w:r>
         <w:t xml:space="preserve">Staff can edit only what was not already signed for (e.g. last-exam date, retest code) and resubmit in one click; fields the patient signed against are locked to preserve the signed declaration’s integrity.</w:t>
       </w:r>
     </w:p>
-    <w:bookmarkEnd w:id="45"/>
-    <w:bookmarkEnd w:id="46"/>
-    <w:bookmarkStart w:id="47" w:name="worklists-dashboard-and-reporting"/>
+    <w:bookmarkEnd w:id="47"/>
+    <w:bookmarkEnd w:id="48"/>
+    <w:bookmarkStart w:id="49" w:name="worklists-dashboard-and-reporting"/>
     <w:p>
       <w:pPr>
         <w:pStyle w:val="Heading1"/>
@@ -2922,7 +3457,7 @@
         <w:pStyle w:val="Compact"/>
         <w:numPr>
           <w:ilvl w:val="0"/>
-          <w:numId w:val="1015"/>
+          <w:numId w:val="1016"/>
         </w:numPr>
       </w:pPr>
       <w:r>
@@ -2944,7 +3479,7 @@
         <w:pStyle w:val="Compact"/>
         <w:numPr>
           <w:ilvl w:val="0"/>
-          <w:numId w:val="1015"/>
+          <w:numId w:val="1016"/>
         </w:numPr>
       </w:pPr>
       <w:r>
@@ -2966,7 +3501,7 @@
         <w:pStyle w:val="Compact"/>
         <w:numPr>
           <w:ilvl w:val="0"/>
-          <w:numId w:val="1015"/>
+          <w:numId w:val="1016"/>
         </w:numPr>
       </w:pPr>
       <w:r>
@@ -2988,7 +3523,7 @@
         <w:pStyle w:val="Compact"/>
         <w:numPr>
           <w:ilvl w:val="0"/>
-          <w:numId w:val="1015"/>
+          <w:numId w:val="1016"/>
         </w:numPr>
       </w:pPr>
       <w:r>
@@ -3010,7 +3545,7 @@
         <w:pStyle w:val="Compact"/>
         <w:numPr>
           <w:ilvl w:val="0"/>
-          <w:numId w:val="1015"/>
+          <w:numId w:val="1016"/>
         </w:numPr>
       </w:pPr>
       <w:r>
@@ -3032,7 +3567,7 @@
         <w:pStyle w:val="Compact"/>
         <w:numPr>
           <w:ilvl w:val="0"/>
-          <w:numId w:val="1015"/>
+          <w:numId w:val="1016"/>
         </w:numPr>
       </w:pPr>
       <w:r>
@@ -3054,7 +3589,7 @@
         <w:pStyle w:val="Compact"/>
         <w:numPr>
           <w:ilvl w:val="0"/>
-          <w:numId w:val="1015"/>
+          <w:numId w:val="1016"/>
         </w:numPr>
       </w:pPr>
       <w:r>
@@ -3076,7 +3611,7 @@
         <w:pStyle w:val="Compact"/>
         <w:numPr>
           <w:ilvl w:val="0"/>
-          <w:numId w:val="1015"/>
+          <w:numId w:val="1016"/>
         </w:numPr>
       </w:pPr>
       <w:r>
@@ -3101,8 +3636,8 @@
         <w:t xml:space="preserve">Reporting also offers claim lists by status, date and form type for print / export, and reconciliation reports (till ↔ eGOS, claimed ↔ paid). Multi-branch groups get estate-wide views. eGOS revenue forecasting (submitted-but-unpaid pipeline, expected income) is provided in the Business Intelligence module.</w:t>
       </w:r>
     </w:p>
-    <w:bookmarkEnd w:id="47"/>
-    <w:bookmarkStart w:id="48" w:name="data-model-entities-and-fields"/>
+    <w:bookmarkEnd w:id="49"/>
+    <w:bookmarkStart w:id="50" w:name="data-model-entities-and-fields"/>
     <w:p>
       <w:pPr>
         <w:pStyle w:val="Heading1"/>
@@ -3124,7 +3659,7 @@
         <w:pStyle w:val="Compact"/>
         <w:numPr>
           <w:ilvl w:val="0"/>
-          <w:numId w:val="1016"/>
+          <w:numId w:val="1017"/>
         </w:numPr>
       </w:pPr>
       <w:r>
@@ -3138,7 +3673,7 @@
         <w:t xml:space="preserve"> </w:t>
       </w:r>
       <w:r>
-        <w:t xml:space="preserve">— patient, appointment, performer, contractor,</w:t>
+        <w:t xml:space="preserve">— patient, appointment,</w:t>
       </w:r>
       <w:r>
         <w:t xml:space="preserve"> </w:t>
@@ -3147,9 +3682,60 @@
         <w:rPr>
           <w:rStyle w:val="VerbatimChar"/>
         </w:rPr>
+        <w:t xml:space="preserve">SightExamID</w:t>
+      </w:r>
+      <w:r>
+        <w:t xml:space="preserve">, performer, contractor,</w:t>
+      </w:r>
+      <w:r>
+        <w:t xml:space="preserve"> </w:t>
+      </w:r>
+      <w:r>
+        <w:rPr>
+          <w:rStyle w:val="VerbatimChar"/>
+        </w:rPr>
         <w:t xml:space="preserve">FormType</w:t>
       </w:r>
       <w:r>
+        <w:t xml:space="preserve"> </w:t>
+      </w:r>
+      <w:r>
+        <w:t xml:space="preserve">(incl. </w:t>
+      </w:r>
+      <w:r>
+        <w:rPr>
+          <w:rStyle w:val="VerbatimChar"/>
+        </w:rPr>
+        <w:t xml:space="preserve">GOS3_VO</w:t>
+      </w:r>
+      <w:r>
+        <w:t xml:space="preserve"> </w:t>
+      </w:r>
+      <w:r>
+        <w:t xml:space="preserve">and</w:t>
+      </w:r>
+      <w:r>
+        <w:t xml:space="preserve"> </w:t>
+      </w:r>
+      <w:r>
+        <w:rPr>
+          <w:rStyle w:val="VerbatimChar"/>
+        </w:rPr>
+        <w:t xml:space="preserve">GOS3_RETRIEVAL</w:t>
+      </w:r>
+      <w:r>
+        <w:t xml:space="preserve">),</w:t>
+      </w:r>
+      <w:r>
+        <w:t xml:space="preserve"> </w:t>
+      </w:r>
+      <w:r>
+        <w:rPr>
+          <w:rStyle w:val="VerbatimChar"/>
+        </w:rPr>
+        <w:t xml:space="preserve">Status</w:t>
+      </w:r>
+      <w:r>
         <w:t xml:space="preserve">,</w:t>
       </w:r>
       <w:r>
@@ -3159,7 +3745,37 @@
         <w:rPr>
           <w:rStyle w:val="VerbatimChar"/>
         </w:rPr>
-        <w:t xml:space="preserve">Status</w:t>
+        <w:t xml:space="preserve">Readiness</w:t>
+      </w:r>
+      <w:r>
+        <w:t xml:space="preserve"> </w:t>
+      </w:r>
+      <w:r>
+        <w:t xml:space="preserve">(the §7 checklist flags), internal and NHS references,</w:t>
+      </w:r>
+      <w:r>
+        <w:t xml:space="preserve"> </w:t>
+      </w:r>
+      <w:r>
+        <w:rPr>
+          <w:rStyle w:val="VerbatimChar"/>
+        </w:rPr>
+        <w:t xml:space="preserve">FormPayload</w:t>
+      </w:r>
+      <w:r>
+        <w:t xml:space="preserve"> </w:t>
+      </w:r>
+      <w:r>
+        <w:t xml:space="preserve">(versioned JSON for the GOS form),</w:t>
+      </w:r>
+      <w:r>
+        <w:t xml:space="preserve"> </w:t>
+      </w:r>
+      <w:r>
+        <w:rPr>
+          <w:rStyle w:val="VerbatimChar"/>
+        </w:rPr>
+        <w:t xml:space="preserve">ClaimedAmount</w:t>
       </w:r>
       <w:r>
         <w:t xml:space="preserve">,</w:t>
@@ -3171,13 +3787,13 @@
         <w:rPr>
           <w:rStyle w:val="VerbatimChar"/>
         </w:rPr>
-        <w:t xml:space="preserve">Readiness</w:t>
-      </w:r>
-      <w:r>
-        <w:t xml:space="preserve"> </w:t>
-      </w:r>
-      <w:r>
-        <w:t xml:space="preserve">(the §7 checklist flags), internal and NHS references,</w:t>
+        <w:t xml:space="preserve">PaidAmount</w:t>
+      </w:r>
+      <w:r>
+        <w:t xml:space="preserve"> </w:t>
+      </w:r>
+      <w:r>
+        <w:t xml:space="preserve">/</w:t>
       </w:r>
       <w:r>
         <w:t xml:space="preserve"> </w:t>
@@ -3186,13 +3802,10 @@
         <w:rPr>
           <w:rStyle w:val="VerbatimChar"/>
         </w:rPr>
-        <w:t xml:space="preserve">FormPayload</w:t>
-      </w:r>
-      <w:r>
-        <w:t xml:space="preserve"> </w:t>
-      </w:r>
-      <w:r>
-        <w:t xml:space="preserve">(versioned JSON for the GOS form),</w:t>
+        <w:t xml:space="preserve">PaidDate</w:t>
+      </w:r>
+      <w:r>
+        <w:t xml:space="preserve">, eligibility (reason, signatory identity, ethnicity, declaration date, able-to-sign),</w:t>
       </w:r>
       <w:r>
         <w:t xml:space="preserve"> </w:t>
@@ -3201,7 +3814,52 @@
         <w:rPr>
           <w:rStyle w:val="VerbatimChar"/>
         </w:rPr>
-        <w:t xml:space="preserve">ClaimedAmount</w:t>
+        <w:t xml:space="preserve">NhsApprovalCode</w:t>
+      </w:r>
+      <w:r>
+        <w:t xml:space="preserve"> </w:t>
+      </w:r>
+      <w:r>
+        <w:t xml:space="preserve">(GOS4),</w:t>
+      </w:r>
+      <w:r>
+        <w:t xml:space="preserve"> </w:t>
+      </w:r>
+      <w:r>
+        <w:rPr>
+          <w:rStyle w:val="VerbatimChar"/>
+        </w:rPr>
+        <w:t xml:space="preserve">VoucherCode</w:t>
+      </w:r>
+      <w:r>
+        <w:t xml:space="preserve"> </w:t>
+      </w:r>
+      <w:r>
+        <w:t xml:space="preserve">/</w:t>
+      </w:r>
+      <w:r>
+        <w:t xml:space="preserve"> </w:t>
+      </w:r>
+      <w:r>
+        <w:rPr>
+          <w:rStyle w:val="VerbatimChar"/>
+        </w:rPr>
+        <w:t xml:space="preserve">AuthorisationCode</w:t>
+      </w:r>
+      <w:r>
+        <w:t xml:space="preserve"> </w:t>
+      </w:r>
+      <w:r>
+        <w:t xml:space="preserve">(GOS3 takeaway / retrieval),</w:t>
+      </w:r>
+      <w:r>
+        <w:t xml:space="preserve"> </w:t>
+      </w:r>
+      <w:r>
+        <w:rPr>
+          <w:rStyle w:val="VerbatimChar"/>
+        </w:rPr>
+        <w:t xml:space="preserve">PvnID</w:t>
       </w:r>
       <w:r>
         <w:t xml:space="preserve">,</w:t>
@@ -3213,13 +3871,54 @@
         <w:rPr>
           <w:rStyle w:val="VerbatimChar"/>
         </w:rPr>
-        <w:t xml:space="preserve">PaidAmount</w:t>
-      </w:r>
-      <w:r>
-        <w:t xml:space="preserve"> </w:t>
-      </w:r>
-      <w:r>
-        <w:t xml:space="preserve">/</w:t>
+        <w:t xml:space="preserve">VenueID</w:t>
+      </w:r>
+      <w:r>
+        <w:t xml:space="preserve">, timestamps, created-by.</w:t>
+      </w:r>
+    </w:p>
+    <w:p>
+      <w:pPr>
+        <w:pStyle w:val="Compact"/>
+        <w:numPr>
+          <w:ilvl w:val="0"/>
+          <w:numId w:val="1017"/>
+        </w:numPr>
+      </w:pPr>
+      <w:r>
+        <w:rPr>
+          <w:b/>
+          <w:bCs/>
+        </w:rPr>
+        <w:t xml:space="preserve">EgosClaimEvent</w:t>
+      </w:r>
+      <w:r>
+        <w:t xml:space="preserve"> </w:t>
+      </w:r>
+      <w:r>
+        <w:t xml:space="preserve">— append-only audit of every status transition (who / when / from → to / payload).</w:t>
+      </w:r>
+    </w:p>
+    <w:p>
+      <w:pPr>
+        <w:pStyle w:val="Compact"/>
+        <w:numPr>
+          <w:ilvl w:val="0"/>
+          <w:numId w:val="1017"/>
+        </w:numPr>
+      </w:pPr>
+      <w:r>
+        <w:rPr>
+          <w:b/>
+          <w:bCs/>
+        </w:rPr>
+        <w:t xml:space="preserve">EgosSignature</w:t>
+      </w:r>
+      <w:r>
+        <w:t xml:space="preserve"> </w:t>
+      </w:r>
+      <w:r>
+        <w:t xml:space="preserve">—</w:t>
       </w:r>
       <w:r>
         <w:t xml:space="preserve"> </w:t>
@@ -3228,10 +3927,13 @@
         <w:rPr>
           <w:rStyle w:val="VerbatimChar"/>
         </w:rPr>
-        <w:t xml:space="preserve">PaidDate</w:t>
-      </w:r>
-      <w:r>
-        <w:t xml:space="preserve">, eligibility,</w:t>
+        <w:t xml:space="preserve">ClaimID</w:t>
+      </w:r>
+      <w:r>
+        <w:t xml:space="preserve"> </w:t>
+      </w:r>
+      <w:r>
+        <w:t xml:space="preserve">(nullable while a signature is stored before its claim exists),</w:t>
       </w:r>
       <w:r>
         <w:t xml:space="preserve"> </w:t>
@@ -3240,13 +3942,13 @@
         <w:rPr>
           <w:rStyle w:val="VerbatimChar"/>
         </w:rPr>
-        <w:t xml:space="preserve">NhsApprovalCode</w:t>
-      </w:r>
-      <w:r>
-        <w:t xml:space="preserve"> </w:t>
-      </w:r>
-      <w:r>
-        <w:t xml:space="preserve">(GOS4),</w:t>
+        <w:t xml:space="preserve">Role</w:t>
+      </w:r>
+      <w:r>
+        <w:t xml:space="preserve"> </w:t>
+      </w:r>
+      <w:r>
+        <w:t xml:space="preserve">(patient / performer / contractor),</w:t>
       </w:r>
       <w:r>
         <w:t xml:space="preserve"> </w:t>
@@ -3255,116 +3957,21 @@
         <w:rPr>
           <w:rStyle w:val="VerbatimChar"/>
         </w:rPr>
-        <w:t xml:space="preserve">PvnID</w:t>
-      </w:r>
-      <w:r>
-        <w:t xml:space="preserve">,</w:t>
-      </w:r>
-      <w:r>
-        <w:t xml:space="preserve"> </w:t>
-      </w:r>
-      <w:r>
-        <w:rPr>
-          <w:rStyle w:val="VerbatimChar"/>
-        </w:rPr>
-        <w:t xml:space="preserve">VenueID</w:t>
-      </w:r>
-      <w:r>
-        <w:t xml:space="preserve">, timestamps, created-by.</w:t>
-      </w:r>
-    </w:p>
-    <w:p>
-      <w:pPr>
-        <w:pStyle w:val="Compact"/>
-        <w:numPr>
-          <w:ilvl w:val="0"/>
-          <w:numId w:val="1016"/>
-        </w:numPr>
-      </w:pPr>
-      <w:r>
-        <w:rPr>
-          <w:b/>
-          <w:bCs/>
-        </w:rPr>
-        <w:t xml:space="preserve">EgosClaimEvent</w:t>
-      </w:r>
-      <w:r>
-        <w:t xml:space="preserve"> </w:t>
-      </w:r>
-      <w:r>
-        <w:t xml:space="preserve">— append-only audit of every status transition (who / when / from → to / payload).</w:t>
-      </w:r>
-    </w:p>
-    <w:p>
-      <w:pPr>
-        <w:pStyle w:val="Compact"/>
-        <w:numPr>
-          <w:ilvl w:val="0"/>
-          <w:numId w:val="1016"/>
-        </w:numPr>
-      </w:pPr>
-      <w:r>
-        <w:rPr>
-          <w:b/>
-          <w:bCs/>
-        </w:rPr>
-        <w:t xml:space="preserve">EgosSignature</w:t>
-      </w:r>
-      <w:r>
-        <w:t xml:space="preserve"> </w:t>
-      </w:r>
-      <w:r>
-        <w:t xml:space="preserve">—</w:t>
-      </w:r>
-      <w:r>
-        <w:t xml:space="preserve"> </w:t>
-      </w:r>
-      <w:r>
-        <w:rPr>
-          <w:rStyle w:val="VerbatimChar"/>
-        </w:rPr>
-        <w:t xml:space="preserve">ClaimID</w:t>
-      </w:r>
-      <w:r>
-        <w:t xml:space="preserve">,</w:t>
-      </w:r>
-      <w:r>
-        <w:t xml:space="preserve"> </w:t>
-      </w:r>
-      <w:r>
-        <w:rPr>
-          <w:rStyle w:val="VerbatimChar"/>
-        </w:rPr>
-        <w:t xml:space="preserve">Role</w:t>
-      </w:r>
-      <w:r>
-        <w:t xml:space="preserve"> </w:t>
-      </w:r>
-      <w:r>
-        <w:t xml:space="preserve">(patient / performer / contractor),</w:t>
-      </w:r>
-      <w:r>
-        <w:t xml:space="preserve"> </w:t>
-      </w:r>
-      <w:r>
-        <w:rPr>
-          <w:rStyle w:val="VerbatimChar"/>
-        </w:rPr>
         <w:t xml:space="preserve">Stage</w:t>
       </w:r>
       <w:r>
         <w:t xml:space="preserve"> </w:t>
       </w:r>
       <w:r>
-        <w:t xml:space="preserve">(GOS3 1-of-2 / 2-of-2), image reference, capture metadata, declaration version.</w:t>
-      </w:r>
-    </w:p>
-    <w:p>
-      <w:pPr>
-        <w:pStyle w:val="Compact"/>
-        <w:numPr>
-          <w:ilvl w:val="0"/>
-          <w:numId w:val="1016"/>
+        <w:t xml:space="preserve">(GOS3 1-of-2 / 2-of-2), image reference, capture metadata, declaration version, and — for a pre-exam patient signature — the capture time and 12-hour apportionment window.</w:t>
+      </w:r>
+    </w:p>
+    <w:p>
+      <w:pPr>
+        <w:pStyle w:val="Compact"/>
+        <w:numPr>
+          <w:ilvl w:val="0"/>
+          <w:numId w:val="1017"/>
         </w:numPr>
       </w:pPr>
       <w:r>
@@ -3386,7 +3993,7 @@
         <w:pStyle w:val="Compact"/>
         <w:numPr>
           <w:ilvl w:val="0"/>
-          <w:numId w:val="1016"/>
+          <w:numId w:val="1017"/>
         </w:numPr>
       </w:pPr>
       <w:r>
@@ -3408,7 +4015,7 @@
         <w:pStyle w:val="Compact"/>
         <w:numPr>
           <w:ilvl w:val="0"/>
-          <w:numId w:val="1016"/>
+          <w:numId w:val="1017"/>
         </w:numPr>
       </w:pPr>
       <w:r>
@@ -3430,7 +4037,7 @@
         <w:pStyle w:val="Compact"/>
         <w:numPr>
           <w:ilvl w:val="0"/>
-          <w:numId w:val="1016"/>
+          <w:numId w:val="1017"/>
         </w:numPr>
       </w:pPr>
       <w:r>
@@ -3455,8 +4062,8 @@
         <w:t xml:space="preserve">GOS form fields are stored as versioned JSON validated against the schema version recorded on the row, so NHS form revisions do not break historical records.</w:t>
       </w:r>
     </w:p>
-    <w:bookmarkEnd w:id="48"/>
-    <w:bookmarkStart w:id="52" w:name="X02621a3e32cb2319f07482058fee364aab7c419"/>
+    <w:bookmarkEnd w:id="50"/>
+    <w:bookmarkStart w:id="54" w:name="X02621a3e32cb2319f07482058fee364aab7c419"/>
     <w:p>
       <w:pPr>
         <w:pStyle w:val="Heading1"/>
@@ -3465,7 +4072,7 @@
         <w:t xml:space="preserve">12. Integration with other modules and the NHS Gateway</w:t>
       </w:r>
     </w:p>
-    <w:bookmarkStart w:id="49" w:name="module-integrations"/>
+    <w:bookmarkStart w:id="51" w:name="module-integrations"/>
     <w:p>
       <w:pPr>
         <w:pStyle w:val="Heading2"/>
@@ -3479,7 +4086,7 @@
         <w:pStyle w:val="Compact"/>
         <w:numPr>
           <w:ilvl w:val="0"/>
-          <w:numId w:val="1017"/>
+          <w:numId w:val="1018"/>
         </w:numPr>
       </w:pPr>
       <w:r>
@@ -3501,7 +4108,7 @@
         <w:pStyle w:val="Compact"/>
         <w:numPr>
           <w:ilvl w:val="0"/>
-          <w:numId w:val="1017"/>
+          <w:numId w:val="1018"/>
         </w:numPr>
       </w:pPr>
       <w:r>
@@ -3535,7 +4142,7 @@
         <w:pStyle w:val="Compact"/>
         <w:numPr>
           <w:ilvl w:val="0"/>
-          <w:numId w:val="1017"/>
+          <w:numId w:val="1018"/>
         </w:numPr>
       </w:pPr>
       <w:r>
@@ -3557,7 +4164,7 @@
         <w:pStyle w:val="Compact"/>
         <w:numPr>
           <w:ilvl w:val="0"/>
-          <w:numId w:val="1017"/>
+          <w:numId w:val="1018"/>
         </w:numPr>
       </w:pPr>
       <w:r>
@@ -3579,7 +4186,7 @@
         <w:pStyle w:val="Compact"/>
         <w:numPr>
           <w:ilvl w:val="0"/>
-          <w:numId w:val="1017"/>
+          <w:numId w:val="1018"/>
         </w:numPr>
       </w:pPr>
       <w:r>
@@ -3596,8 +4203,8 @@
         <w:t xml:space="preserve">— delivers the signing-session push and patient chase.</w:t>
       </w:r>
     </w:p>
-    <w:bookmarkEnd w:id="49"/>
-    <w:bookmarkStart w:id="50" w:name="Xc811e6b767c7bdc4547e0a89d06e6acc5093e9b"/>
+    <w:bookmarkEnd w:id="51"/>
+    <w:bookmarkStart w:id="52" w:name="Xc811e6b767c7bdc4547e0a89d06e6acc5093e9b"/>
     <w:p>
       <w:pPr>
         <w:pStyle w:val="Heading2"/>
@@ -3635,7 +4242,7 @@
         <w:pStyle w:val="Compact"/>
         <w:numPr>
           <w:ilvl w:val="0"/>
-          <w:numId w:val="1018"/>
+          <w:numId w:val="1019"/>
         </w:numPr>
       </w:pPr>
       <w:r>
@@ -3657,7 +4264,7 @@
         <w:pStyle w:val="Compact"/>
         <w:numPr>
           <w:ilvl w:val="0"/>
-          <w:numId w:val="1018"/>
+          <w:numId w:val="1019"/>
         </w:numPr>
       </w:pPr>
       <w:r>
@@ -3679,7 +4286,7 @@
         <w:pStyle w:val="Compact"/>
         <w:numPr>
           <w:ilvl w:val="0"/>
-          <w:numId w:val="1018"/>
+          <w:numId w:val="1019"/>
         </w:numPr>
       </w:pPr>
       <w:r>
@@ -3701,7 +4308,7 @@
         <w:pStyle w:val="Compact"/>
         <w:numPr>
           <w:ilvl w:val="0"/>
-          <w:numId w:val="1018"/>
+          <w:numId w:val="1019"/>
         </w:numPr>
       </w:pPr>
       <w:r>
@@ -3723,7 +4330,7 @@
         <w:pStyle w:val="Compact"/>
         <w:numPr>
           <w:ilvl w:val="0"/>
-          <w:numId w:val="1018"/>
+          <w:numId w:val="1019"/>
         </w:numPr>
       </w:pPr>
       <w:r>
@@ -3748,8 +4355,8 @@
         <w:t xml:space="preserve">Isolating all NHS specifics behind the Gateway means the rest of the module is built and tested against a mock Gateway now and wired to the live endpoints on sign-up without touching workflow code.</w:t>
       </w:r>
     </w:p>
-    <w:bookmarkEnd w:id="50"/>
-    <w:bookmarkStart w:id="51" w:name="submission-worker"/>
+    <w:bookmarkEnd w:id="52"/>
+    <w:bookmarkStart w:id="53" w:name="submission-worker"/>
     <w:p>
       <w:pPr>
         <w:pStyle w:val="Heading2"/>
@@ -3766,9 +4373,9 @@
         <w:t xml:space="preserve">A queue-backed worker builds the NHS message, submits it via the Gateway, processes the response and advances claim status. It is idempotent (dedupes on the internal reference so a retry cannot double-claim), retries with backoff on Gateway unavailability, and dead-letters for manual review.</w:t>
       </w:r>
     </w:p>
-    <w:bookmarkEnd w:id="51"/>
-    <w:bookmarkEnd w:id="52"/>
-    <w:bookmarkStart w:id="53" w:name="security-compliance-and-audit"/>
+    <w:bookmarkEnd w:id="53"/>
+    <w:bookmarkEnd w:id="54"/>
+    <w:bookmarkStart w:id="55" w:name="security-compliance-and-audit"/>
     <w:p>
       <w:pPr>
         <w:pStyle w:val="Heading1"/>
@@ -3782,7 +4389,7 @@
         <w:pStyle w:val="Compact"/>
         <w:numPr>
           <w:ilvl w:val="0"/>
-          <w:numId w:val="1019"/>
+          <w:numId w:val="1020"/>
         </w:numPr>
       </w:pPr>
       <w:r>
@@ -3794,7 +4401,7 @@
         <w:pStyle w:val="Compact"/>
         <w:numPr>
           <w:ilvl w:val="0"/>
-          <w:numId w:val="1019"/>
+          <w:numId w:val="1020"/>
         </w:numPr>
       </w:pPr>
       <w:r>
@@ -3806,7 +4413,7 @@
         <w:pStyle w:val="Compact"/>
         <w:numPr>
           <w:ilvl w:val="0"/>
-          <w:numId w:val="1019"/>
+          <w:numId w:val="1020"/>
         </w:numPr>
       </w:pPr>
       <w:r>
@@ -3818,7 +4425,7 @@
         <w:pStyle w:val="Compact"/>
         <w:numPr>
           <w:ilvl w:val="0"/>
-          <w:numId w:val="1019"/>
+          <w:numId w:val="1020"/>
         </w:numPr>
       </w:pPr>
       <w:r>
@@ -3830,7 +4437,7 @@
         <w:pStyle w:val="Compact"/>
         <w:numPr>
           <w:ilvl w:val="0"/>
-          <w:numId w:val="1019"/>
+          <w:numId w:val="1020"/>
         </w:numPr>
       </w:pPr>
       <w:r>
@@ -3842,15 +4449,15 @@
         <w:pStyle w:val="Compact"/>
         <w:numPr>
           <w:ilvl w:val="0"/>
-          <w:numId w:val="1019"/>
+          <w:numId w:val="1020"/>
         </w:numPr>
       </w:pPr>
       <w:r>
         <w:t xml:space="preserve">Role-based access controls the eGOS capability and the Performer / Contractor roles.</w:t>
       </w:r>
     </w:p>
-    <w:bookmarkEnd w:id="53"/>
-    <w:bookmarkStart w:id="57" w:name="competitive-analysis-and-differentiation"/>
+    <w:bookmarkEnd w:id="55"/>
+    <w:bookmarkStart w:id="59" w:name="competitive-analysis-and-differentiation"/>
     <w:p>
       <w:pPr>
         <w:pStyle w:val="Heading1"/>
@@ -3867,7 +4474,7 @@
         <w:t xml:space="preserve">Optix is the most eGOS-mature competitor reviewed; its help and release material show a polished voucher-creation experience but stop short of the submission, domiciliary, reporting and money-management layers. The incumbent FLEX / Nova product covers the full GOS set but as a desktop application with cloud workarounds.</w:t>
       </w:r>
     </w:p>
-    <w:bookmarkStart w:id="54" w:name="parity-targets-matched-above"/>
+    <w:bookmarkStart w:id="56" w:name="parity-targets-matched-above"/>
     <w:p>
       <w:pPr>
         <w:pStyle w:val="Heading2"/>
@@ -3881,7 +4488,7 @@
         <w:pStyle w:val="Compact"/>
         <w:numPr>
           <w:ilvl w:val="0"/>
-          <w:numId w:val="1020"/>
+          <w:numId w:val="1021"/>
         </w:numPr>
       </w:pPr>
       <w:r>
@@ -3893,7 +4500,7 @@
         <w:pStyle w:val="Compact"/>
         <w:numPr>
           <w:ilvl w:val="0"/>
-          <w:numId w:val="1020"/>
+          <w:numId w:val="1021"/>
         </w:numPr>
       </w:pPr>
       <w:r>
@@ -3905,7 +4512,7 @@
         <w:pStyle w:val="Compact"/>
         <w:numPr>
           <w:ilvl w:val="0"/>
-          <w:numId w:val="1020"/>
+          <w:numId w:val="1021"/>
         </w:numPr>
       </w:pPr>
       <w:r>
@@ -3917,7 +4524,7 @@
         <w:pStyle w:val="Compact"/>
         <w:numPr>
           <w:ilvl w:val="0"/>
-          <w:numId w:val="1020"/>
+          <w:numId w:val="1021"/>
         </w:numPr>
       </w:pPr>
       <w:r>
@@ -3929,7 +4536,7 @@
         <w:pStyle w:val="Compact"/>
         <w:numPr>
           <w:ilvl w:val="0"/>
-          <w:numId w:val="1020"/>
+          <w:numId w:val="1021"/>
         </w:numPr>
       </w:pPr>
       <w:r>
@@ -3941,7 +4548,7 @@
         <w:pStyle w:val="Compact"/>
         <w:numPr>
           <w:ilvl w:val="0"/>
-          <w:numId w:val="1020"/>
+          <w:numId w:val="1021"/>
         </w:numPr>
       </w:pPr>
       <w:r>
@@ -3953,15 +4560,15 @@
         <w:pStyle w:val="Compact"/>
         <w:numPr>
           <w:ilvl w:val="0"/>
-          <w:numId w:val="1020"/>
+          <w:numId w:val="1021"/>
         </w:numPr>
       </w:pPr>
       <w:r>
         <w:t xml:space="preserve">Rejection → task, edit non-signed fields, resubmit (§9.3).</w:t>
       </w:r>
     </w:p>
-    <w:bookmarkEnd w:id="54"/>
-    <w:bookmarkStart w:id="55" w:name="where-competitors-stop-our-openings"/>
+    <w:bookmarkEnd w:id="56"/>
+    <w:bookmarkStart w:id="57" w:name="where-competitors-stop-our-openings"/>
     <w:p>
       <w:pPr>
         <w:pStyle w:val="Heading2"/>
@@ -3975,7 +4582,7 @@
         <w:pStyle w:val="Compact"/>
         <w:numPr>
           <w:ilvl w:val="0"/>
-          <w:numId w:val="1021"/>
+          <w:numId w:val="1022"/>
         </w:numPr>
       </w:pPr>
       <w:r>
@@ -3997,7 +4604,7 @@
         <w:pStyle w:val="Compact"/>
         <w:numPr>
           <w:ilvl w:val="0"/>
-          <w:numId w:val="1021"/>
+          <w:numId w:val="1022"/>
         </w:numPr>
       </w:pPr>
       <w:r>
@@ -4019,7 +4626,7 @@
         <w:pStyle w:val="Compact"/>
         <w:numPr>
           <w:ilvl w:val="0"/>
-          <w:numId w:val="1021"/>
+          <w:numId w:val="1022"/>
         </w:numPr>
       </w:pPr>
       <w:r>
@@ -4041,7 +4648,7 @@
         <w:pStyle w:val="Compact"/>
         <w:numPr>
           <w:ilvl w:val="0"/>
-          <w:numId w:val="1021"/>
+          <w:numId w:val="1022"/>
         </w:numPr>
       </w:pPr>
       <w:r>
@@ -4077,7 +4684,7 @@
         <w:pStyle w:val="Compact"/>
         <w:numPr>
           <w:ilvl w:val="0"/>
-          <w:numId w:val="1021"/>
+          <w:numId w:val="1022"/>
         </w:numPr>
       </w:pPr>
       <w:r>
@@ -4099,7 +4706,7 @@
         <w:pStyle w:val="Compact"/>
         <w:numPr>
           <w:ilvl w:val="0"/>
-          <w:numId w:val="1021"/>
+          <w:numId w:val="1022"/>
         </w:numPr>
       </w:pPr>
       <w:r>
@@ -4110,8 +4717,8 @@
         <w:t xml:space="preserve">No AI, no voice.</w:t>
       </w:r>
     </w:p>
-    <w:bookmarkEnd w:id="55"/>
-    <w:bookmarkStart w:id="56" w:name="smartoptics-differentiators"/>
+    <w:bookmarkEnd w:id="57"/>
+    <w:bookmarkStart w:id="58" w:name="smartoptics-differentiators"/>
     <w:p>
       <w:pPr>
         <w:pStyle w:val="Heading2"/>
@@ -4125,7 +4732,7 @@
         <w:pStyle w:val="Compact"/>
         <w:numPr>
           <w:ilvl w:val="0"/>
-          <w:numId w:val="1022"/>
+          <w:numId w:val="1023"/>
         </w:numPr>
       </w:pPr>
       <w:r>
@@ -4147,7 +4754,7 @@
         <w:pStyle w:val="Compact"/>
         <w:numPr>
           <w:ilvl w:val="0"/>
-          <w:numId w:val="1022"/>
+          <w:numId w:val="1023"/>
         </w:numPr>
       </w:pPr>
       <w:r>
@@ -4169,7 +4776,7 @@
         <w:pStyle w:val="Compact"/>
         <w:numPr>
           <w:ilvl w:val="0"/>
-          <w:numId w:val="1022"/>
+          <w:numId w:val="1023"/>
         </w:numPr>
       </w:pPr>
       <w:r>
@@ -4191,7 +4798,7 @@
         <w:pStyle w:val="Compact"/>
         <w:numPr>
           <w:ilvl w:val="0"/>
-          <w:numId w:val="1022"/>
+          <w:numId w:val="1023"/>
         </w:numPr>
       </w:pPr>
       <w:r>
@@ -4213,7 +4820,7 @@
         <w:pStyle w:val="Compact"/>
         <w:numPr>
           <w:ilvl w:val="0"/>
-          <w:numId w:val="1022"/>
+          <w:numId w:val="1023"/>
         </w:numPr>
       </w:pPr>
       <w:r>
@@ -4235,7 +4842,7 @@
         <w:pStyle w:val="Compact"/>
         <w:numPr>
           <w:ilvl w:val="0"/>
-          <w:numId w:val="1022"/>
+          <w:numId w:val="1023"/>
         </w:numPr>
       </w:pPr>
       <w:r>
@@ -4257,7 +4864,7 @@
         <w:pStyle w:val="Compact"/>
         <w:numPr>
           <w:ilvl w:val="0"/>
-          <w:numId w:val="1022"/>
+          <w:numId w:val="1023"/>
         </w:numPr>
       </w:pPr>
       <w:r>
@@ -4279,7 +4886,7 @@
         <w:pStyle w:val="Compact"/>
         <w:numPr>
           <w:ilvl w:val="0"/>
-          <w:numId w:val="1022"/>
+          <w:numId w:val="1023"/>
         </w:numPr>
       </w:pPr>
       <w:r>
@@ -4296,9 +4903,9 @@
         <w:t xml:space="preserve">— shows why a figure was reached (which supplements / bands / contributions), so practices can defend it in an audit.</w:t>
       </w:r>
     </w:p>
-    <w:bookmarkEnd w:id="56"/>
-    <w:bookmarkEnd w:id="57"/>
-    <w:bookmarkStart w:id="58" w:name="feature-comparison-matrix"/>
+    <w:bookmarkEnd w:id="58"/>
+    <w:bookmarkEnd w:id="59"/>
+    <w:bookmarkStart w:id="60" w:name="feature-comparison-matrix"/>
     <w:p>
       <w:pPr>
         <w:pStyle w:val="Heading1"/>
@@ -5654,8 +6261,8 @@
         </w:tc>
       </w:tr>
     </w:tbl>
-    <w:bookmarkEnd w:id="58"/>
-    <w:bookmarkStart w:id="59" w:name="phased-delivery"/>
+    <w:bookmarkEnd w:id="60"/>
+    <w:bookmarkStart w:id="61" w:name="phased-delivery"/>
     <w:p>
       <w:pPr>
         <w:pStyle w:val="Heading1"/>
@@ -5669,7 +6276,7 @@
         <w:pStyle w:val="Compact"/>
         <w:numPr>
           <w:ilvl w:val="0"/>
-          <w:numId w:val="1023"/>
+          <w:numId w:val="1024"/>
         </w:numPr>
       </w:pPr>
       <w:r>
@@ -5691,7 +6298,7 @@
         <w:pStyle w:val="Compact"/>
         <w:numPr>
           <w:ilvl w:val="0"/>
-          <w:numId w:val="1023"/>
+          <w:numId w:val="1024"/>
         </w:numPr>
       </w:pPr>
       <w:r>
@@ -5713,7 +6320,7 @@
         <w:pStyle w:val="Compact"/>
         <w:numPr>
           <w:ilvl w:val="0"/>
-          <w:numId w:val="1023"/>
+          <w:numId w:val="1024"/>
         </w:numPr>
       </w:pPr>
       <w:r>
@@ -5735,7 +6342,7 @@
         <w:pStyle w:val="Compact"/>
         <w:numPr>
           <w:ilvl w:val="0"/>
-          <w:numId w:val="1023"/>
+          <w:numId w:val="1024"/>
         </w:numPr>
       </w:pPr>
       <w:r>
@@ -5757,7 +6364,7 @@
         <w:pStyle w:val="Compact"/>
         <w:numPr>
           <w:ilvl w:val="0"/>
-          <w:numId w:val="1023"/>
+          <w:numId w:val="1024"/>
         </w:numPr>
       </w:pPr>
       <w:r>
@@ -5782,8 +6389,8 @@
         <w:t xml:space="preserve">Each phase is independently shippable and reuses the Phase-1 submission, signing and worklist plumbing.</w:t>
       </w:r>
     </w:p>
-    <w:bookmarkEnd w:id="59"/>
-    <w:bookmarkStart w:id="60" w:name="open-questions"/>
+    <w:bookmarkEnd w:id="61"/>
+    <w:bookmarkStart w:id="62" w:name="open-questions"/>
     <w:p>
       <w:pPr>
         <w:pStyle w:val="Heading1"/>
@@ -5797,7 +6404,7 @@
         <w:pStyle w:val="Compact"/>
         <w:numPr>
           <w:ilvl w:val="0"/>
-          <w:numId w:val="1024"/>
+          <w:numId w:val="1025"/>
         </w:numPr>
       </w:pPr>
       <w:r>
@@ -5809,7 +6416,7 @@
         <w:pStyle w:val="Compact"/>
         <w:numPr>
           <w:ilvl w:val="0"/>
-          <w:numId w:val="1024"/>
+          <w:numId w:val="1025"/>
         </w:numPr>
       </w:pPr>
       <w:r>
@@ -5821,7 +6428,7 @@
         <w:pStyle w:val="Compact"/>
         <w:numPr>
           <w:ilvl w:val="0"/>
-          <w:numId w:val="1024"/>
+          <w:numId w:val="1025"/>
         </w:numPr>
       </w:pPr>
       <w:r>
@@ -5833,7 +6440,7 @@
         <w:pStyle w:val="Compact"/>
         <w:numPr>
           <w:ilvl w:val="0"/>
-          <w:numId w:val="1024"/>
+          <w:numId w:val="1025"/>
         </w:numPr>
       </w:pPr>
       <w:r>
@@ -5845,7 +6452,7 @@
         <w:pStyle w:val="Compact"/>
         <w:numPr>
           <w:ilvl w:val="0"/>
-          <w:numId w:val="1024"/>
+          <w:numId w:val="1025"/>
         </w:numPr>
       </w:pPr>
       <w:r>
@@ -5857,15 +6464,15 @@
         <w:pStyle w:val="Compact"/>
         <w:numPr>
           <w:ilvl w:val="0"/>
-          <w:numId w:val="1024"/>
+          <w:numId w:val="1025"/>
         </w:numPr>
       </w:pPr>
       <w:r>
         <w:t xml:space="preserve">Q6 — Confirm whether estate-wide / group submission and cross-branch dashboards are MVP or a fast-follow.</w:t>
       </w:r>
     </w:p>
-    <w:bookmarkEnd w:id="60"/>
-    <w:bookmarkStart w:id="61" w:name="appendix-referenced-documents"/>
+    <w:bookmarkEnd w:id="62"/>
+    <w:bookmarkStart w:id="63" w:name="appendix-referenced-documents"/>
     <w:p>
       <w:pPr>
         <w:pStyle w:val="Heading1"/>
@@ -5879,7 +6486,7 @@
         <w:pStyle w:val="Compact"/>
         <w:numPr>
           <w:ilvl w:val="0"/>
-          <w:numId w:val="1025"/>
+          <w:numId w:val="1026"/>
         </w:numPr>
       </w:pPr>
       <w:r>
@@ -5891,7 +6498,7 @@
         <w:pStyle w:val="Compact"/>
         <w:numPr>
           <w:ilvl w:val="0"/>
-          <w:numId w:val="1025"/>
+          <w:numId w:val="1026"/>
         </w:numPr>
       </w:pPr>
       <w:r>
@@ -5903,7 +6510,7 @@
         <w:pStyle w:val="Compact"/>
         <w:numPr>
           <w:ilvl w:val="0"/>
-          <w:numId w:val="1025"/>
+          <w:numId w:val="1026"/>
         </w:numPr>
       </w:pPr>
       <w:r>
@@ -5915,7 +6522,7 @@
         <w:pStyle w:val="Compact"/>
         <w:numPr>
           <w:ilvl w:val="0"/>
-          <w:numId w:val="1025"/>
+          <w:numId w:val="1026"/>
         </w:numPr>
       </w:pPr>
       <w:r>
@@ -5927,7 +6534,7 @@
         <w:pStyle w:val="Compact"/>
         <w:numPr>
           <w:ilvl w:val="0"/>
-          <w:numId w:val="1025"/>
+          <w:numId w:val="1026"/>
         </w:numPr>
       </w:pPr>
       <w:r>
@@ -5939,7 +6546,7 @@
         <w:pStyle w:val="Compact"/>
         <w:numPr>
           <w:ilvl w:val="0"/>
-          <w:numId w:val="1025"/>
+          <w:numId w:val="1026"/>
         </w:numPr>
       </w:pPr>
       <w:r>
@@ -5951,7 +6558,7 @@
         <w:pStyle w:val="Compact"/>
         <w:numPr>
           <w:ilvl w:val="0"/>
-          <w:numId w:val="1025"/>
+          <w:numId w:val="1026"/>
         </w:numPr>
       </w:pPr>
       <w:r>
@@ -5963,14 +6570,14 @@
         <w:pStyle w:val="Compact"/>
         <w:numPr>
           <w:ilvl w:val="0"/>
-          <w:numId w:val="1025"/>
-        </w:numPr>
-      </w:pPr>
-      <w:r>
-        <w:t xml:space="preserve">Source material: Optinet FLEX / Nova eGOS help articles (England overview, claims reports, checking submissions, signature webpage, signing on Android / Apple, PVN and GOS6, GOS3 takeaway retrieval, optometrist signatures, viewing all claims, management screen, voucher reconciliation); Optix / Optix 2 help documentation (Optix &amp; Audix eGOS, GOS3, GOS4, Business Intelligence, release notes).</w:t>
-      </w:r>
-    </w:p>
-    <w:bookmarkEnd w:id="61"/>
+          <w:numId w:val="1026"/>
+        </w:numPr>
+      </w:pPr>
+      <w:r>
+        <w:t xml:space="preserve">Source material: Optinet Nova eGOS User Guide; Optinet FLEX / Nova eGOS help articles (England overview, claims reports, checking submissions, signature webpage, signing on Android / Apple, PVN and GOS6, GOS3 takeaway retrieval, optometrist signatures, viewing all claims, management screen, voucher reconciliation); Optix / Optix 2 help documentation (Optix &amp; Audix eGOS, GOS3, GOS4, Business Intelligence, release notes).</w:t>
+      </w:r>
+    </w:p>
+    <w:bookmarkEnd w:id="63"/>
     <w:sectPr>
       <w:headerReference r:id="rId7" w:type="default"/>
       <w:footerReference r:id="rId8" w:type="default"/>
@@ -6073,7 +6680,7 @@
         <w:sz w:val="18"/>
         <w:szCs w:val="18"/>
       </w:rPr>
-      <w:t xml:space="preserve">SmartOptics — eGOS (NHS England) Module Spec Rev 1</w:t>
+      <w:t xml:space="preserve">SmartOptics — eGOS (NHS England) Module Spec Rev 2</w:t>
     </w:r>
   </w:p>
 </w:hdr>
@@ -6547,9 +7154,6 @@
     </w:lvlOverride>
   </w:num>
   <w:num w:numId="1010">
-    <w:abstractNumId w:val="991"/>
-  </w:num>
-  <w:num w:numId="1011">
     <w:abstractNumId w:val="99411"/>
     <w:lvlOverride w:ilvl="0">
       <w:startOverride w:val="1"/>
@@ -6579,34 +7183,10 @@
       <w:startOverride w:val="1"/>
     </w:lvlOverride>
   </w:num>
-  <w:num w:numId="1012">
+  <w:num w:numId="1011">
     <w:abstractNumId w:val="991"/>
   </w:num>
-  <w:num w:numId="1013">
-    <w:abstractNumId w:val="991"/>
-  </w:num>
-  <w:num w:numId="1014">
-    <w:abstractNumId w:val="991"/>
-  </w:num>
-  <w:num w:numId="1015">
-    <w:abstractNumId w:val="991"/>
-  </w:num>
-  <w:num w:numId="1016">
-    <w:abstractNumId w:val="991"/>
-  </w:num>
-  <w:num w:numId="1017">
-    <w:abstractNumId w:val="991"/>
-  </w:num>
-  <w:num w:numId="1018">
-    <w:abstractNumId w:val="991"/>
-  </w:num>
-  <w:num w:numId="1019">
-    <w:abstractNumId w:val="991"/>
-  </w:num>
-  <w:num w:numId="1020">
-    <w:abstractNumId w:val="991"/>
-  </w:num>
-  <w:num w:numId="1021">
+  <w:num w:numId="1012">
     <w:abstractNumId w:val="99411"/>
     <w:lvlOverride w:ilvl="0">
       <w:startOverride w:val="1"/>
@@ -6636,10 +7216,34 @@
       <w:startOverride w:val="1"/>
     </w:lvlOverride>
   </w:num>
-  <w:num w:numId="1022">
+  <w:num w:numId="1013">
     <w:abstractNumId w:val="991"/>
   </w:num>
-  <w:num w:numId="1023">
+  <w:num w:numId="1014">
+    <w:abstractNumId w:val="991"/>
+  </w:num>
+  <w:num w:numId="1015">
+    <w:abstractNumId w:val="991"/>
+  </w:num>
+  <w:num w:numId="1016">
+    <w:abstractNumId w:val="991"/>
+  </w:num>
+  <w:num w:numId="1017">
+    <w:abstractNumId w:val="991"/>
+  </w:num>
+  <w:num w:numId="1018">
+    <w:abstractNumId w:val="991"/>
+  </w:num>
+  <w:num w:numId="1019">
+    <w:abstractNumId w:val="991"/>
+  </w:num>
+  <w:num w:numId="1020">
+    <w:abstractNumId w:val="991"/>
+  </w:num>
+  <w:num w:numId="1021">
+    <w:abstractNumId w:val="991"/>
+  </w:num>
+  <w:num w:numId="1022">
     <w:abstractNumId w:val="99411"/>
     <w:lvlOverride w:ilvl="0">
       <w:startOverride w:val="1"/>
@@ -6669,10 +7273,43 @@
       <w:startOverride w:val="1"/>
     </w:lvlOverride>
   </w:num>
-  <w:num w:numId="1024">
+  <w:num w:numId="1023">
     <w:abstractNumId w:val="991"/>
   </w:num>
+  <w:num w:numId="1024">
+    <w:abstractNumId w:val="99411"/>
+    <w:lvlOverride w:ilvl="0">
+      <w:startOverride w:val="1"/>
+    </w:lvlOverride>
+    <w:lvlOverride w:ilvl="1">
+      <w:startOverride w:val="1"/>
+    </w:lvlOverride>
+    <w:lvlOverride w:ilvl="2">
+      <w:startOverride w:val="1"/>
+    </w:lvlOverride>
+    <w:lvlOverride w:ilvl="3">
+      <w:startOverride w:val="1"/>
+    </w:lvlOverride>
+    <w:lvlOverride w:ilvl="4">
+      <w:startOverride w:val="1"/>
+    </w:lvlOverride>
+    <w:lvlOverride w:ilvl="5">
+      <w:startOverride w:val="1"/>
+    </w:lvlOverride>
+    <w:lvlOverride w:ilvl="6">
+      <w:startOverride w:val="1"/>
+    </w:lvlOverride>
+    <w:lvlOverride w:ilvl="7">
+      <w:startOverride w:val="1"/>
+    </w:lvlOverride>
+    <w:lvlOverride w:ilvl="8">
+      <w:startOverride w:val="1"/>
+    </w:lvlOverride>
+  </w:num>
   <w:num w:numId="1025">
+    <w:abstractNumId w:val="991"/>
+  </w:num>
+  <w:num w:numId="1026">
     <w:abstractNumId w:val="991"/>
   </w:num>
 </w:numbering>

</xml_diff>